<commit_message>
발당 탄수 카드(SOFeatureAddBulletCount) 4종과 선행 카드(m_refRequire) 조건 추가, 카드 아이콘
-SOFeatureAddBulletCount: 대상 무기 타입의 발당 탄수를 레벨당 +m_iCountPerLevel. Cancel은 누적분 전부 회수

-eFeatureID: AddBulletCount / AddMissileBulletCount / AddMissileCount / AddBeamCount 추가

-SOFeature.m_refRequire: 선행 카드 참조. FeatureManager.RequestFeature가 선행 카드 레벨 0이면 후보에서 제외
</commit_message>
<xml_diff>
--- a/Docs/GameDesign/오비탈_기획서_v2.docx
+++ b/Docs/GameDesign/오비탈_기획서_v2.docx
@@ -1,6 +1,6 @@
 
 <file path=word/document.xml><?xml version="1.0" encoding="utf-8"?>
-<w:document xmlns:wpc="http://schemas.microsoft.com/office/word/2010/wordprocessingCanvas" xmlns:cx="http://schemas.microsoft.com/office/drawing/2014/chartex" xmlns:cx1="http://schemas.microsoft.com/office/drawing/2015/9/8/chartex" xmlns:cx2="http://schemas.microsoft.com/office/drawing/2015/10/21/chartex" xmlns:cx3="http://schemas.microsoft.com/office/drawing/2016/5/9/chartex" xmlns:cx4="http://schemas.microsoft.com/office/drawing/2016/5/10/chartex" xmlns:cx5="http://schemas.microsoft.com/office/drawing/2016/5/11/chartex" xmlns:cx6="http://schemas.microsoft.com/office/drawing/2016/5/12/chartex" xmlns:cx7="http://schemas.microsoft.com/office/drawing/2016/5/13/chartex" xmlns:cx8="http://schemas.microsoft.com/office/drawing/2016/5/14/chartex" xmlns:mc="http://schemas.openxmlformats.org/markup-compatibility/2006" xmlns:aink="http://schemas.microsoft.com/office/drawing/2016/ink" xmlns:am3d="http://schemas.microsoft.com/office/drawing/2017/model3d" xmlns:o="urn:schemas-microsoft-com:office:office" xmlns:oel="http://schemas.microsoft.com/office/2019/extlst" xmlns:r="http://schemas.openxmlformats.org/officeDocument/2006/relationships" xmlns:m="http://schemas.openxmlformats.org/officeDocument/2006/math" xmlns:v="urn:schemas-microsoft-com:vml" xmlns:wp14="http://schemas.microsoft.com/office/word/2010/wordprocessingDrawing" xmlns:wp="http://schemas.openxmlformats.org/drawingml/2006/wordprocessingDrawing" xmlns:w10="urn:schemas-microsoft-com:office:word" xmlns:w="http://schemas.openxmlformats.org/wordprocessingml/2006/main" xmlns:w14="http://schemas.microsoft.com/office/word/2010/wordml" xmlns:w15="http://schemas.microsoft.com/office/word/2012/wordml" xmlns:w16cex="http://schemas.microsoft.com/office/word/2018/wordml/cex" xmlns:w16cid="http://schemas.microsoft.com/office/word/2016/wordml/cid" xmlns:w16="http://schemas.microsoft.com/office/word/2018/wordml" xmlns:w16du="http://schemas.microsoft.com/office/word/2023/wordml/word16du" xmlns:w16sdtdh="http://schemas.microsoft.com/office/word/2020/wordml/sdtdatahash" xmlns:w16sdtfl="http://schemas.microsoft.com/office/word/2024/wordml/sdtformatlock" xmlns:w16se="http://schemas.microsoft.com/office/word/2015/wordml/symex" xmlns:wpg="http://schemas.microsoft.com/office/word/2010/wordprocessingGroup" xmlns:wpi="http://schemas.microsoft.com/office/word/2010/wordprocessingInk" xmlns:wne="http://schemas.microsoft.com/office/word/2006/wordml" xmlns:wps="http://schemas.microsoft.com/office/word/2010/wordprocessingShape" mc:Ignorable="w14 w15 w16se w16cid w16 w16cex w16sdtdh w16sdtfl w16du wp14">
+<w:document xmlns:wpc="http://schemas.microsoft.com/office/word/2010/wordprocessingCanvas" xmlns:cx="http://schemas.microsoft.com/office/drawing/2014/chartex" xmlns:mc="http://schemas.openxmlformats.org/markup-compatibility/2006" xmlns:o="urn:schemas-microsoft-com:office:office" xmlns:r="http://schemas.openxmlformats.org/officeDocument/2006/relationships" xmlns:m="http://schemas.openxmlformats.org/officeDocument/2006/math" xmlns:v="urn:schemas-microsoft-com:vml" xmlns:wp14="http://schemas.microsoft.com/office/word/2010/wordprocessingDrawing" xmlns:wp="http://schemas.openxmlformats.org/drawingml/2006/wordprocessingDrawing" xmlns:w10="urn:schemas-microsoft-com:office:word" xmlns:w="http://schemas.openxmlformats.org/wordprocessingml/2006/main" xmlns:w14="http://schemas.microsoft.com/office/word/2010/wordml" xmlns:w15="http://schemas.microsoft.com/office/word/2012/wordml" xmlns:w16se="http://schemas.microsoft.com/office/word/2015/wordml/symex" xmlns:wpg="http://schemas.microsoft.com/office/word/2010/wordprocessingGroup" xmlns:wpi="http://schemas.microsoft.com/office/word/2010/wordprocessingInk" xmlns:wne="http://schemas.microsoft.com/office/word/2006/wordml" xmlns:wps="http://schemas.microsoft.com/office/word/2010/wordprocessingShape" mc:Ignorable="w14 w15 w16se wp14">
   <w:body>
     <w:p>
       <w:pPr>
@@ -79,7 +79,25 @@
           <w:iCs/>
           <w:color w:val="5B5A67"/>
         </w:rPr>
-        <w:t xml:space="preserve"> 3택과 등급형 조커 카드 도박이라는 이중 랜덤을 얹은 하이 리스크·하이 리턴 </w:t>
+        <w:t xml:space="preserve"> 3택과 </w:t>
+      </w:r>
+      <w:proofErr w:type="spellStart"/>
+      <w:r>
+        <w:rPr>
+          <w:i/>
+          <w:iCs/>
+          <w:color w:val="5B5A67"/>
+        </w:rPr>
+        <w:t>등급형</w:t>
+      </w:r>
+      <w:proofErr w:type="spellEnd"/>
+      <w:r>
+        <w:rPr>
+          <w:i/>
+          <w:iCs/>
+          <w:color w:val="5B5A67"/>
+        </w:rPr>
+        <w:t xml:space="preserve"> 조커 카드 도박이라는 이중 랜덤을 얹은 하이 리스크·하이 리턴 </w:t>
       </w:r>
       <w:proofErr w:type="spellStart"/>
       <w:r>
@@ -160,81 +178,40 @@
           <w:szCs w:val="18"/>
         </w:rPr>
         <w:tab/>
-      </w:r>
-      <w:proofErr w:type="gramStart"/>
+        <w:t xml:space="preserve">장르  </w:t>
+      </w:r>
+      <w:r>
+        <w:rPr>
+          <w:sz w:val="18"/>
+          <w:szCs w:val="18"/>
+        </w:rPr>
+        <w:t xml:space="preserve">3D 슈팅 · </w:t>
+      </w:r>
+      <w:proofErr w:type="spellStart"/>
+      <w:r>
+        <w:rPr>
+          <w:sz w:val="18"/>
+          <w:szCs w:val="18"/>
+        </w:rPr>
+        <w:t>로그라이트</w:t>
+      </w:r>
+      <w:proofErr w:type="spellEnd"/>
       <w:r>
         <w:rPr>
           <w:color w:val="6B6A75"/>
           <w:sz w:val="18"/>
           <w:szCs w:val="18"/>
         </w:rPr>
-        <w:t xml:space="preserve">장르  </w:t>
+        <w:tab/>
+        <w:t xml:space="preserve">플랫폼  </w:t>
       </w:r>
       <w:r>
         <w:rPr>
           <w:sz w:val="18"/>
           <w:szCs w:val="18"/>
         </w:rPr>
-        <w:t>3</w:t>
-      </w:r>
-      <w:proofErr w:type="gramEnd"/>
-      <w:r>
-        <w:rPr>
-          <w:sz w:val="18"/>
-          <w:szCs w:val="18"/>
-        </w:rPr>
-        <w:t xml:space="preserve">D 슈팅 · </w:t>
-      </w:r>
-      <w:proofErr w:type="spellStart"/>
-      <w:r>
-        <w:rPr>
-          <w:sz w:val="18"/>
-          <w:szCs w:val="18"/>
-        </w:rPr>
-        <w:t>로그라이트</w:t>
-      </w:r>
-      <w:proofErr w:type="spellEnd"/>
-      <w:r>
-        <w:rPr>
-          <w:color w:val="6B6A75"/>
-          <w:sz w:val="18"/>
-          <w:szCs w:val="18"/>
-        </w:rPr>
-        <w:tab/>
-      </w:r>
-      <w:proofErr w:type="gramStart"/>
-      <w:r>
-        <w:rPr>
-          <w:color w:val="6B6A75"/>
-          <w:sz w:val="18"/>
-          <w:szCs w:val="18"/>
-        </w:rPr>
-        <w:t xml:space="preserve">플랫폼  </w:t>
-      </w:r>
-      <w:r>
-        <w:rPr>
-          <w:sz w:val="18"/>
-          <w:szCs w:val="18"/>
-        </w:rPr>
-        <w:t>Windows</w:t>
-      </w:r>
-      <w:proofErr w:type="gramEnd"/>
-      <w:r>
-        <w:rPr>
-          <w:sz w:val="18"/>
-          <w:szCs w:val="18"/>
-        </w:rPr>
-        <w:t xml:space="preserve"> </w:t>
-      </w:r>
-      <w:proofErr w:type="gramStart"/>
-      <w:r>
-        <w:rPr>
-          <w:sz w:val="18"/>
-          <w:szCs w:val="18"/>
-        </w:rPr>
-        <w:t>/ Android</w:t>
-      </w:r>
-      <w:proofErr w:type="gramEnd"/>
+        <w:t>Windows / Android</w:t>
+      </w:r>
     </w:p>
     <w:p>
       <w:pPr>
@@ -287,12 +264,6 @@
         <w:gridCol w:w="7526"/>
       </w:tblGrid>
       <w:tr>
-        <w:tblPrEx>
-          <w:tblCellMar>
-            <w:top w:w="0" w:type="dxa"/>
-            <w:bottom w:w="0" w:type="dxa"/>
-          </w:tblCellMar>
-        </w:tblPrEx>
         <w:tc>
           <w:tcPr>
             <w:tcW w:w="1500" w:type="dxa"/>
@@ -359,12 +330,6 @@
         </w:tc>
       </w:tr>
       <w:tr>
-        <w:tblPrEx>
-          <w:tblCellMar>
-            <w:top w:w="0" w:type="dxa"/>
-            <w:bottom w:w="0" w:type="dxa"/>
-          </w:tblCellMar>
-        </w:tblPrEx>
         <w:tc>
           <w:tcPr>
             <w:tcW w:w="1500" w:type="dxa"/>
@@ -429,12 +394,6 @@
         </w:tc>
       </w:tr>
       <w:tr>
-        <w:tblPrEx>
-          <w:tblCellMar>
-            <w:top w:w="0" w:type="dxa"/>
-            <w:bottom w:w="0" w:type="dxa"/>
-          </w:tblCellMar>
-        </w:tblPrEx>
         <w:tc>
           <w:tcPr>
             <w:tcW w:w="1500" w:type="dxa"/>
@@ -506,12 +465,6 @@
         </w:tc>
       </w:tr>
       <w:tr>
-        <w:tblPrEx>
-          <w:tblCellMar>
-            <w:top w:w="0" w:type="dxa"/>
-            <w:bottom w:w="0" w:type="dxa"/>
-          </w:tblCellMar>
-        </w:tblPrEx>
         <w:tc>
           <w:tcPr>
             <w:tcW w:w="1500" w:type="dxa"/>
@@ -574,12 +527,6 @@
         </w:tc>
       </w:tr>
       <w:tr>
-        <w:tblPrEx>
-          <w:tblCellMar>
-            <w:top w:w="0" w:type="dxa"/>
-            <w:bottom w:w="0" w:type="dxa"/>
-          </w:tblCellMar>
-        </w:tblPrEx>
         <w:tc>
           <w:tcPr>
             <w:tcW w:w="1500" w:type="dxa"/>
@@ -642,12 +589,6 @@
         </w:tc>
       </w:tr>
       <w:tr>
-        <w:tblPrEx>
-          <w:tblCellMar>
-            <w:top w:w="0" w:type="dxa"/>
-            <w:bottom w:w="0" w:type="dxa"/>
-          </w:tblCellMar>
-        </w:tblPrEx>
         <w:tc>
           <w:tcPr>
             <w:tcW w:w="1500" w:type="dxa"/>
@@ -798,15 +739,7 @@
         <w:spacing w:after="180" w:line="300" w:lineRule="auto"/>
       </w:pPr>
       <w:r>
-        <w:t xml:space="preserve">복잡하고 진입 장벽이 높은 게임이 많은 시장에서, 직관성과 단순함이 주는 본질적인 재미에 집중한다. 배우는 데 시간이 들지 않고, 한 판이 짧게 끝나며, 매번 다른 조합으로 다시 하고 </w:t>
-      </w:r>
-      <w:proofErr w:type="spellStart"/>
-      <w:r>
-        <w:t>싶어지는</w:t>
-      </w:r>
-      <w:proofErr w:type="spellEnd"/>
-      <w:r>
-        <w:t xml:space="preserve"> 게임이 목표다.</w:t>
+        <w:t>복잡하고 진입 장벽이 높은 게임이 많은 시장에서, 직관성과 단순함이 주는 본질적인 재미에 집중한다. 배우는 데 시간이 들지 않고, 한 판이 짧게 끝나며, 매번 다른 조합으로 다시 하고 싶어지는 게임이 목표다.</w:t>
       </w:r>
     </w:p>
     <w:p>
@@ -896,7 +829,15 @@
         <w:t>조커 카드 도박</w:t>
       </w:r>
       <w:r>
-        <w:t xml:space="preserve"> — 선택적 고위험 성장. 플레이어가 원할 때 도전하는 확률형 </w:t>
+        <w:t xml:space="preserve"> — 선택적 고위험 성장. 플레이어가 원할 때 도전하는 </w:t>
+      </w:r>
+      <w:proofErr w:type="spellStart"/>
+      <w:r>
+        <w:t>확률형</w:t>
+      </w:r>
+      <w:proofErr w:type="spellEnd"/>
+      <w:r>
+        <w:t xml:space="preserve"> </w:t>
       </w:r>
       <w:proofErr w:type="spellStart"/>
       <w:r>
@@ -975,12 +916,6 @@
         <w:gridCol w:w="1376"/>
       </w:tblGrid>
       <w:tr>
-        <w:tblPrEx>
-          <w:tblCellMar>
-            <w:top w:w="0" w:type="dxa"/>
-            <w:bottom w:w="0" w:type="dxa"/>
-          </w:tblCellMar>
-        </w:tblPrEx>
         <w:tc>
           <w:tcPr>
             <w:tcW w:w="900" w:type="dxa"/>
@@ -1118,9 +1053,6 @@
           <w:p>
             <w:pPr>
               <w:jc w:val="center"/>
-              <w:rPr>
-                <w:rFonts w:hint="eastAsia"/>
-              </w:rPr>
             </w:pPr>
             <w:r>
               <w:rPr>
@@ -1197,19 +1129,8 @@
                 <w:sz w:val="18"/>
                 <w:szCs w:val="18"/>
               </w:rPr>
-              <w:t xml:space="preserve"> 3</w:t>
-            </w:r>
-            <w:proofErr w:type="gramStart"/>
-            <w:r>
-              <w:rPr>
-                <w:b/>
-                <w:bCs/>
-                <w:sz w:val="18"/>
-                <w:szCs w:val="18"/>
-              </w:rPr>
-              <w:t>택 /</w:t>
-            </w:r>
-            <w:proofErr w:type="gramEnd"/>
+              <w:t xml:space="preserve"> 3택 /</w:t>
+            </w:r>
           </w:p>
           <w:p>
             <w:pPr>
@@ -1283,9 +1204,6 @@
           <w:p>
             <w:pPr>
               <w:jc w:val="center"/>
-              <w:rPr>
-                <w:rFonts w:hint="eastAsia"/>
-              </w:rPr>
             </w:pPr>
             <w:r>
               <w:rPr>
@@ -1463,12 +1381,6 @@
         <w:gridCol w:w="7826"/>
       </w:tblGrid>
       <w:tr>
-        <w:tblPrEx>
-          <w:tblCellMar>
-            <w:top w:w="0" w:type="dxa"/>
-            <w:bottom w:w="0" w:type="dxa"/>
-          </w:tblCellMar>
-        </w:tblPrEx>
         <w:tc>
           <w:tcPr>
             <w:tcW w:w="1200" w:type="dxa"/>
@@ -1535,12 +1447,6 @@
         </w:tc>
       </w:tr>
       <w:tr>
-        <w:tblPrEx>
-          <w:tblCellMar>
-            <w:top w:w="0" w:type="dxa"/>
-            <w:bottom w:w="0" w:type="dxa"/>
-          </w:tblCellMar>
-        </w:tblPrEx>
         <w:tc>
           <w:tcPr>
             <w:tcW w:w="1200" w:type="dxa"/>
@@ -1605,12 +1511,6 @@
         </w:tc>
       </w:tr>
       <w:tr>
-        <w:tblPrEx>
-          <w:tblCellMar>
-            <w:top w:w="0" w:type="dxa"/>
-            <w:bottom w:w="0" w:type="dxa"/>
-          </w:tblCellMar>
-        </w:tblPrEx>
         <w:tc>
           <w:tcPr>
             <w:tcW w:w="1200" w:type="dxa"/>
@@ -1675,12 +1575,6 @@
         </w:tc>
       </w:tr>
       <w:tr>
-        <w:tblPrEx>
-          <w:tblCellMar>
-            <w:top w:w="0" w:type="dxa"/>
-            <w:bottom w:w="0" w:type="dxa"/>
-          </w:tblCellMar>
-        </w:tblPrEx>
         <w:tc>
           <w:tcPr>
             <w:tcW w:w="1200" w:type="dxa"/>
@@ -1743,12 +1637,6 @@
         </w:tc>
       </w:tr>
       <w:tr>
-        <w:tblPrEx>
-          <w:tblCellMar>
-            <w:top w:w="0" w:type="dxa"/>
-            <w:bottom w:w="0" w:type="dxa"/>
-          </w:tblCellMar>
-        </w:tblPrEx>
         <w:tc>
           <w:tcPr>
             <w:tcW w:w="1200" w:type="dxa"/>
@@ -1811,12 +1699,6 @@
         </w:tc>
       </w:tr>
       <w:tr>
-        <w:tblPrEx>
-          <w:tblCellMar>
-            <w:top w:w="0" w:type="dxa"/>
-            <w:bottom w:w="0" w:type="dxa"/>
-          </w:tblCellMar>
-        </w:tblPrEx>
         <w:tc>
           <w:tcPr>
             <w:tcW w:w="1200" w:type="dxa"/>
@@ -1977,12 +1859,6 @@
         <w:gridCol w:w="1506"/>
       </w:tblGrid>
       <w:tr>
-        <w:tblPrEx>
-          <w:tblCellMar>
-            <w:top w:w="0" w:type="dxa"/>
-            <w:bottom w:w="0" w:type="dxa"/>
-          </w:tblCellMar>
-        </w:tblPrEx>
         <w:tc>
           <w:tcPr>
             <w:tcW w:w="1500" w:type="dxa"/>
@@ -2297,12 +2173,6 @@
         <w:gridCol w:w="7426"/>
       </w:tblGrid>
       <w:tr>
-        <w:tblPrEx>
-          <w:tblCellMar>
-            <w:top w:w="0" w:type="dxa"/>
-            <w:bottom w:w="0" w:type="dxa"/>
-          </w:tblCellMar>
-        </w:tblPrEx>
         <w:tc>
           <w:tcPr>
             <w:tcW w:w="1600" w:type="dxa"/>
@@ -2369,12 +2239,6 @@
         </w:tc>
       </w:tr>
       <w:tr>
-        <w:tblPrEx>
-          <w:tblCellMar>
-            <w:top w:w="0" w:type="dxa"/>
-            <w:bottom w:w="0" w:type="dxa"/>
-          </w:tblCellMar>
-        </w:tblPrEx>
         <w:tc>
           <w:tcPr>
             <w:tcW w:w="1600" w:type="dxa"/>
@@ -2469,12 +2333,6 @@
         </w:tc>
       </w:tr>
       <w:tr>
-        <w:tblPrEx>
-          <w:tblCellMar>
-            <w:top w:w="0" w:type="dxa"/>
-            <w:bottom w:w="0" w:type="dxa"/>
-          </w:tblCellMar>
-        </w:tblPrEx>
         <w:tc>
           <w:tcPr>
             <w:tcW w:w="1600" w:type="dxa"/>
@@ -2537,12 +2395,6 @@
         </w:tc>
       </w:tr>
       <w:tr>
-        <w:tblPrEx>
-          <w:tblCellMar>
-            <w:top w:w="0" w:type="dxa"/>
-            <w:bottom w:w="0" w:type="dxa"/>
-          </w:tblCellMar>
-        </w:tblPrEx>
         <w:tc>
           <w:tcPr>
             <w:tcW w:w="1600" w:type="dxa"/>
@@ -2659,12 +2511,6 @@
         <w:gridCol w:w="7426"/>
       </w:tblGrid>
       <w:tr>
-        <w:tblPrEx>
-          <w:tblCellMar>
-            <w:top w:w="0" w:type="dxa"/>
-            <w:bottom w:w="0" w:type="dxa"/>
-          </w:tblCellMar>
-        </w:tblPrEx>
         <w:tc>
           <w:tcPr>
             <w:tcW w:w="1600" w:type="dxa"/>
@@ -2731,12 +2577,6 @@
         </w:tc>
       </w:tr>
       <w:tr>
-        <w:tblPrEx>
-          <w:tblCellMar>
-            <w:top w:w="0" w:type="dxa"/>
-            <w:bottom w:w="0" w:type="dxa"/>
-          </w:tblCellMar>
-        </w:tblPrEx>
         <w:tc>
           <w:tcPr>
             <w:tcW w:w="1600" w:type="dxa"/>
@@ -2795,9 +2635,6 @@
           <w:p>
             <w:pPr>
               <w:spacing w:line="280" w:lineRule="auto"/>
-              <w:rPr>
-                <w:rFonts w:hint="eastAsia"/>
-              </w:rPr>
             </w:pPr>
             <w:r>
               <w:rPr>
@@ -2809,12 +2646,6 @@
         </w:tc>
       </w:tr>
       <w:tr>
-        <w:tblPrEx>
-          <w:tblCellMar>
-            <w:top w:w="0" w:type="dxa"/>
-            <w:bottom w:w="0" w:type="dxa"/>
-          </w:tblCellMar>
-        </w:tblPrEx>
         <w:tc>
           <w:tcPr>
             <w:tcW w:w="1600" w:type="dxa"/>
@@ -2873,9 +2704,6 @@
           <w:p>
             <w:pPr>
               <w:spacing w:line="280" w:lineRule="auto"/>
-              <w:rPr>
-                <w:rFonts w:hint="eastAsia"/>
-              </w:rPr>
             </w:pPr>
             <w:proofErr w:type="spellStart"/>
             <w:r>
@@ -2895,12 +2723,6 @@
         </w:tc>
       </w:tr>
       <w:tr>
-        <w:tblPrEx>
-          <w:tblCellMar>
-            <w:top w:w="0" w:type="dxa"/>
-            <w:bottom w:w="0" w:type="dxa"/>
-          </w:tblCellMar>
-        </w:tblPrEx>
         <w:tc>
           <w:tcPr>
             <w:tcW w:w="1600" w:type="dxa"/>
@@ -2959,54 +2781,139 @@
           <w:p>
             <w:pPr>
               <w:spacing w:line="280" w:lineRule="auto"/>
+            </w:pPr>
+            <w:r>
               <w:rPr>
                 <w:rFonts w:hint="eastAsia"/>
               </w:rPr>
-            </w:pPr>
+              <w:t xml:space="preserve">공격력, 공격속도, </w:t>
+            </w:r>
             <w:r>
               <w:rPr>
                 <w:rFonts w:hint="eastAsia"/>
               </w:rPr>
-              <w:t xml:space="preserve">공격력, 공격속도, </w:t>
+              <w:t>도착</w:t>
+            </w:r>
+            <w:r>
+              <w:rPr>
+                <w:rFonts w:hint="eastAsia"/>
+              </w:rPr>
+              <w:t xml:space="preserve"> 시 추가 효과(폭발</w:t>
+            </w:r>
+            <w:proofErr w:type="gramStart"/>
+            <w:r>
+              <w:rPr>
+                <w:rFonts w:hint="eastAsia"/>
+              </w:rPr>
+              <w:t>..</w:t>
+            </w:r>
+            <w:proofErr w:type="gramEnd"/>
+            <w:r>
+              <w:rPr>
+                <w:rFonts w:hint="eastAsia"/>
+              </w:rPr>
+              <w:t>)</w:t>
+            </w:r>
+            <w:r>
+              <w:t xml:space="preserve">, </w:t>
+            </w:r>
+            <w:r>
+              <w:rPr>
+                <w:rFonts w:hint="eastAsia"/>
+              </w:rPr>
+              <w:t>미사일</w:t>
+            </w:r>
+            <w:r>
+              <w:t xml:space="preserve"> </w:t>
+            </w:r>
+            <w:r>
+              <w:rPr>
+                <w:rFonts w:hint="eastAsia"/>
+              </w:rPr>
+              <w:t>공격 추가,</w:t>
+            </w:r>
+            <w:r>
+              <w:t xml:space="preserve"> </w:t>
+            </w:r>
+            <w:r>
+              <w:rPr>
+                <w:rFonts w:hint="eastAsia"/>
+              </w:rPr>
+              <w:t xml:space="preserve">레이저 빔 공격 추가 </w:t>
+            </w:r>
+            <w:r>
+              <w:t xml:space="preserve">, </w:t>
+            </w:r>
+            <w:r>
+              <w:rPr>
+                <w:rFonts w:hint="eastAsia"/>
+              </w:rPr>
+              <w:t>기본 총알 추가,</w:t>
+            </w:r>
+            <w:r>
+              <w:t xml:space="preserve"> </w:t>
+            </w:r>
+            <w:r>
+              <w:rPr>
+                <w:rFonts w:hint="eastAsia"/>
+              </w:rPr>
+              <w:t>추격하는 총알 추가,</w:t>
+            </w:r>
+            <w:r>
+              <w:t xml:space="preserve"> </w:t>
             </w:r>
             <w:proofErr w:type="spellStart"/>
             <w:r>
               <w:rPr>
                 <w:rFonts w:hint="eastAsia"/>
               </w:rPr>
-              <w:t>도차</w:t>
+              <w:t>샷건</w:t>
             </w:r>
             <w:proofErr w:type="spellEnd"/>
             <w:r>
               <w:rPr>
                 <w:rFonts w:hint="eastAsia"/>
               </w:rPr>
-              <w:t xml:space="preserve"> 시 추가 효과(</w:t>
-            </w:r>
-            <w:proofErr w:type="gramStart"/>
+              <w:t xml:space="preserve"> 공격 추가,</w:t>
+            </w:r>
+            <w:r>
+              <w:t xml:space="preserve"> </w:t>
+            </w:r>
             <w:r>
               <w:rPr>
                 <w:rFonts w:hint="eastAsia"/>
               </w:rPr>
-              <w:t>폭발..</w:t>
-            </w:r>
-            <w:proofErr w:type="gramEnd"/>
+              <w:t>차지 공격 추가</w:t>
+            </w:r>
             <w:r>
               <w:rPr>
                 <w:rFonts w:hint="eastAsia"/>
               </w:rPr>
-              <w:t>)</w:t>
-            </w:r>
+              <w:t>,</w:t>
+            </w:r>
+            <w:r>
+              <w:t xml:space="preserve"> </w:t>
+            </w:r>
+            <w:proofErr w:type="spellStart"/>
+            <w:r>
+              <w:rPr>
+                <w:rFonts w:hint="eastAsia"/>
+              </w:rPr>
+              <w:t>드론</w:t>
+            </w:r>
+            <w:proofErr w:type="spellEnd"/>
+            <w:r>
+              <w:rPr>
+                <w:rFonts w:hint="eastAsia"/>
+              </w:rPr>
+              <w:t xml:space="preserve"> 오브젝트 생성</w:t>
+            </w:r>
+            <w:bookmarkStart w:id="0" w:name="_GoBack"/>
+            <w:bookmarkEnd w:id="0"/>
           </w:p>
         </w:tc>
       </w:tr>
       <w:tr>
-        <w:tblPrEx>
-          <w:tblCellMar>
-            <w:top w:w="0" w:type="dxa"/>
-            <w:bottom w:w="0" w:type="dxa"/>
-          </w:tblCellMar>
-        </w:tblPrEx>
         <w:tc>
           <w:tcPr>
             <w:tcW w:w="1600" w:type="dxa"/>
@@ -3065,22 +2972,19 @@
           <w:p>
             <w:pPr>
               <w:spacing w:line="280" w:lineRule="auto"/>
+            </w:pPr>
+            <w:r>
               <w:rPr>
                 <w:rFonts w:hint="eastAsia"/>
               </w:rPr>
-            </w:pPr>
+              <w:t>관통, 명중 시 추가 효과(명중 지점에서 다방면 총알 생성</w:t>
+            </w:r>
+            <w:proofErr w:type="gramStart"/>
             <w:r>
               <w:rPr>
                 <w:rFonts w:hint="eastAsia"/>
               </w:rPr>
-              <w:t xml:space="preserve">관통, 명중 시 추가 효과(명중 지점에서 다방면 총알 </w:t>
-            </w:r>
-            <w:proofErr w:type="gramStart"/>
-            <w:r>
-              <w:rPr>
-                <w:rFonts w:hint="eastAsia"/>
-              </w:rPr>
-              <w:t>생성..</w:t>
+              <w:t>..</w:t>
             </w:r>
             <w:proofErr w:type="gramEnd"/>
             <w:r>
@@ -3093,12 +2997,6 @@
         </w:tc>
       </w:tr>
       <w:tr>
-        <w:tblPrEx>
-          <w:tblCellMar>
-            <w:top w:w="0" w:type="dxa"/>
-            <w:bottom w:w="0" w:type="dxa"/>
-          </w:tblCellMar>
-        </w:tblPrEx>
         <w:tc>
           <w:tcPr>
             <w:tcW w:w="1600" w:type="dxa"/>
@@ -3157,22 +3055,19 @@
           <w:p>
             <w:pPr>
               <w:spacing w:line="280" w:lineRule="auto"/>
+            </w:pPr>
+            <w:r>
               <w:rPr>
                 <w:rFonts w:hint="eastAsia"/>
               </w:rPr>
-            </w:pPr>
+              <w:t>게임을 판도를 뒤집는 카드 (핵폭탄</w:t>
+            </w:r>
+            <w:proofErr w:type="gramStart"/>
             <w:r>
               <w:rPr>
                 <w:rFonts w:hint="eastAsia"/>
               </w:rPr>
-              <w:t>게임을 판도를 뒤집는 카드 (</w:t>
-            </w:r>
-            <w:proofErr w:type="gramStart"/>
-            <w:r>
-              <w:rPr>
-                <w:rFonts w:hint="eastAsia"/>
-              </w:rPr>
-              <w:t>핵폭탄..</w:t>
+              <w:t>..</w:t>
             </w:r>
             <w:proofErr w:type="gramEnd"/>
             <w:r>
@@ -3285,12 +3180,6 @@
         <w:gridCol w:w="2833"/>
       </w:tblGrid>
       <w:tr>
-        <w:tblPrEx>
-          <w:tblCellMar>
-            <w:top w:w="0" w:type="dxa"/>
-            <w:bottom w:w="0" w:type="dxa"/>
-          </w:tblCellMar>
-        </w:tblPrEx>
         <w:tc>
           <w:tcPr>
             <w:tcW w:w="1200" w:type="dxa"/>
@@ -3544,7 +3433,11 @@
         <w:spacing w:before="220" w:after="200" w:line="300" w:lineRule="auto"/>
       </w:pPr>
       <w:r>
-        <w:t>성공해도 효과는 곧바로 적용되지 않고 “보류” 상태로 쌓인다. 플레이어는 보류된 채로 한 번 더 도전해 판을 더 키우거나, 지금까지 쌓은 것을 “캐시아웃”해 확정할 수 있다. 실패하는 순간 보류 중이던 모든 카드가 사라지며, 도전을 반복할수록 이미 확정된 카드까지 잃을 위험이 함께 커진다.</w:t>
+        <w:t xml:space="preserve">성공해도 효과는 곧바로 적용되지 않고 “보류” 상태로 쌓인다. 플레이어는 보류된 채로 한 번 더 도전해 판을 더 키우거나, 지금까지 쌓은 것을 “캐시아웃”해 확정할 수 있다. 실패하는 순간 보류 중이던 </w:t>
+      </w:r>
+      <w:r>
+        <w:lastRenderedPageBreak/>
+        <w:t>모든 카드가 사라지며, 도전을 반복할수록 이미 확정된 카드까지 잃을 위험이 함께 커진다.</w:t>
       </w:r>
     </w:p>
     <w:tbl>
@@ -3570,12 +3463,6 @@
         <w:gridCol w:w="6226"/>
       </w:tblGrid>
       <w:tr>
-        <w:tblPrEx>
-          <w:tblCellMar>
-            <w:top w:w="0" w:type="dxa"/>
-            <w:bottom w:w="0" w:type="dxa"/>
-          </w:tblCellMar>
-        </w:tblPrEx>
         <w:tc>
           <w:tcPr>
             <w:tcW w:w="1600" w:type="dxa"/>
@@ -3604,7 +3491,6 @@
                 <w:sz w:val="19"/>
                 <w:szCs w:val="19"/>
               </w:rPr>
-              <w:lastRenderedPageBreak/>
               <w:t>단계</w:t>
             </w:r>
           </w:p>
@@ -3675,12 +3561,6 @@
         </w:tc>
       </w:tr>
       <w:tr>
-        <w:tblPrEx>
-          <w:tblCellMar>
-            <w:top w:w="0" w:type="dxa"/>
-            <w:bottom w:w="0" w:type="dxa"/>
-          </w:tblCellMar>
-        </w:tblPrEx>
         <w:tc>
           <w:tcPr>
             <w:tcW w:w="1600" w:type="dxa"/>
@@ -3789,12 +3669,6 @@
         </w:tc>
       </w:tr>
       <w:tr>
-        <w:tblPrEx>
-          <w:tblCellMar>
-            <w:top w:w="0" w:type="dxa"/>
-            <w:bottom w:w="0" w:type="dxa"/>
-          </w:tblCellMar>
-        </w:tblPrEx>
         <w:tc>
           <w:tcPr>
             <w:tcW w:w="1600" w:type="dxa"/>
@@ -3903,12 +3777,6 @@
         </w:tc>
       </w:tr>
       <w:tr>
-        <w:tblPrEx>
-          <w:tblCellMar>
-            <w:top w:w="0" w:type="dxa"/>
-            <w:bottom w:w="0" w:type="dxa"/>
-          </w:tblCellMar>
-        </w:tblPrEx>
         <w:tc>
           <w:tcPr>
             <w:tcW w:w="1600" w:type="dxa"/>
@@ -4086,7 +3954,15 @@
       </w:r>
       <w:proofErr w:type="spellEnd"/>
       <w:r>
-        <w:t xml:space="preserve"> 자유롭게 조합할 수 있다. 슬롯별로 정해진 </w:t>
+        <w:t xml:space="preserve"> 자유롭게 조합할 수 있다. </w:t>
+      </w:r>
+      <w:proofErr w:type="spellStart"/>
+      <w:r>
+        <w:t>슬롯별로</w:t>
+      </w:r>
+      <w:proofErr w:type="spellEnd"/>
+      <w:r>
+        <w:t xml:space="preserve"> 정해진 </w:t>
       </w:r>
       <w:proofErr w:type="spellStart"/>
       <w:r>
@@ -4127,12 +4003,6 @@
         <w:gridCol w:w="7826"/>
       </w:tblGrid>
       <w:tr>
-        <w:tblPrEx>
-          <w:tblCellMar>
-            <w:top w:w="0" w:type="dxa"/>
-            <w:bottom w:w="0" w:type="dxa"/>
-          </w:tblCellMar>
-        </w:tblPrEx>
         <w:tc>
           <w:tcPr>
             <w:tcW w:w="1200" w:type="dxa"/>
@@ -4209,12 +4079,6 @@
         </w:tc>
       </w:tr>
       <w:tr>
-        <w:tblPrEx>
-          <w:tblCellMar>
-            <w:top w:w="0" w:type="dxa"/>
-            <w:bottom w:w="0" w:type="dxa"/>
-          </w:tblCellMar>
-        </w:tblPrEx>
         <w:tc>
           <w:tcPr>
             <w:tcW w:w="1200" w:type="dxa"/>
@@ -4265,9 +4129,6 @@
           <w:p>
             <w:pPr>
               <w:spacing w:line="280" w:lineRule="auto"/>
-              <w:rPr>
-                <w:rFonts w:hint="eastAsia"/>
-              </w:rPr>
             </w:pPr>
             <w:r>
               <w:rPr>
@@ -4280,12 +4141,6 @@
         </w:tc>
       </w:tr>
       <w:tr>
-        <w:tblPrEx>
-          <w:tblCellMar>
-            <w:top w:w="0" w:type="dxa"/>
-            <w:bottom w:w="0" w:type="dxa"/>
-          </w:tblCellMar>
-        </w:tblPrEx>
         <w:tc>
           <w:tcPr>
             <w:tcW w:w="1200" w:type="dxa"/>
@@ -4336,9 +4191,6 @@
           <w:p>
             <w:pPr>
               <w:spacing w:line="280" w:lineRule="auto"/>
-              <w:rPr>
-                <w:rFonts w:hint="eastAsia"/>
-              </w:rPr>
             </w:pPr>
             <w:r>
               <w:rPr>
@@ -4351,12 +4203,6 @@
         </w:tc>
       </w:tr>
       <w:tr>
-        <w:tblPrEx>
-          <w:tblCellMar>
-            <w:top w:w="0" w:type="dxa"/>
-            <w:bottom w:w="0" w:type="dxa"/>
-          </w:tblCellMar>
-        </w:tblPrEx>
         <w:tc>
           <w:tcPr>
             <w:tcW w:w="1200" w:type="dxa"/>
@@ -4407,9 +4253,6 @@
           <w:p>
             <w:pPr>
               <w:spacing w:line="280" w:lineRule="auto"/>
-              <w:rPr>
-                <w:rFonts w:hint="eastAsia"/>
-              </w:rPr>
             </w:pPr>
             <w:r>
               <w:rPr>
@@ -4422,12 +4265,6 @@
         </w:tc>
       </w:tr>
       <w:tr>
-        <w:tblPrEx>
-          <w:tblCellMar>
-            <w:top w:w="0" w:type="dxa"/>
-            <w:bottom w:w="0" w:type="dxa"/>
-          </w:tblCellMar>
-        </w:tblPrEx>
         <w:tc>
           <w:tcPr>
             <w:tcW w:w="1200" w:type="dxa"/>
@@ -4478,9 +4315,6 @@
           <w:p>
             <w:pPr>
               <w:spacing w:line="280" w:lineRule="auto"/>
-              <w:rPr>
-                <w:rFonts w:hint="eastAsia"/>
-              </w:rPr>
             </w:pPr>
             <w:r>
               <w:rPr>
@@ -4642,9 +4476,6 @@
     <w:p>
       <w:pPr>
         <w:spacing w:after="180" w:line="300" w:lineRule="auto"/>
-        <w:rPr>
-          <w:rFonts w:hint="eastAsia"/>
-        </w:rPr>
       </w:pPr>
       <w:r>
         <w:t xml:space="preserve">조커 카드 도박의 성공 확률, 후보/선택 개수, 실패 시 손실 폭, 등급별 등장 비중과, </w:t>
@@ -4677,7 +4508,7 @@
 </file>
 
 <file path=word/endnotes.xml><?xml version="1.0" encoding="utf-8"?>
-<w:endnotes xmlns:wpc="http://schemas.microsoft.com/office/word/2010/wordprocessingCanvas" xmlns:cx="http://schemas.microsoft.com/office/drawing/2014/chartex" xmlns:cx1="http://schemas.microsoft.com/office/drawing/2015/9/8/chartex" xmlns:cx2="http://schemas.microsoft.com/office/drawing/2015/10/21/chartex" xmlns:cx3="http://schemas.microsoft.com/office/drawing/2016/5/9/chartex" xmlns:cx4="http://schemas.microsoft.com/office/drawing/2016/5/10/chartex" xmlns:cx5="http://schemas.microsoft.com/office/drawing/2016/5/11/chartex" xmlns:cx6="http://schemas.microsoft.com/office/drawing/2016/5/12/chartex" xmlns:cx7="http://schemas.microsoft.com/office/drawing/2016/5/13/chartex" xmlns:cx8="http://schemas.microsoft.com/office/drawing/2016/5/14/chartex" xmlns:mc="http://schemas.openxmlformats.org/markup-compatibility/2006" xmlns:aink="http://schemas.microsoft.com/office/drawing/2016/ink" xmlns:am3d="http://schemas.microsoft.com/office/drawing/2017/model3d" xmlns:o="urn:schemas-microsoft-com:office:office" xmlns:oel="http://schemas.microsoft.com/office/2019/extlst" xmlns:r="http://schemas.openxmlformats.org/officeDocument/2006/relationships" xmlns:m="http://schemas.openxmlformats.org/officeDocument/2006/math" xmlns:v="urn:schemas-microsoft-com:vml" xmlns:wp14="http://schemas.microsoft.com/office/word/2010/wordprocessingDrawing" xmlns:wp="http://schemas.openxmlformats.org/drawingml/2006/wordprocessingDrawing" xmlns:w10="urn:schemas-microsoft-com:office:word" xmlns:w="http://schemas.openxmlformats.org/wordprocessingml/2006/main" xmlns:w14="http://schemas.microsoft.com/office/word/2010/wordml" xmlns:w15="http://schemas.microsoft.com/office/word/2012/wordml" xmlns:w16cex="http://schemas.microsoft.com/office/word/2018/wordml/cex" xmlns:w16cid="http://schemas.microsoft.com/office/word/2016/wordml/cid" xmlns:w16="http://schemas.microsoft.com/office/word/2018/wordml" xmlns:w16du="http://schemas.microsoft.com/office/word/2023/wordml/word16du" xmlns:w16sdtdh="http://schemas.microsoft.com/office/word/2020/wordml/sdtdatahash" xmlns:w16sdtfl="http://schemas.microsoft.com/office/word/2024/wordml/sdtformatlock" xmlns:w16se="http://schemas.microsoft.com/office/word/2015/wordml/symex" xmlns:wpg="http://schemas.microsoft.com/office/word/2010/wordprocessingGroup" xmlns:wpi="http://schemas.microsoft.com/office/word/2010/wordprocessingInk" xmlns:wne="http://schemas.microsoft.com/office/word/2006/wordml" xmlns:wps="http://schemas.microsoft.com/office/word/2010/wordprocessingShape" mc:Ignorable="w14 w15 w16se w16cid w16 w16cex w16sdtdh w16sdtfl w16du wp14">
+<w:endnotes xmlns:wpc="http://schemas.microsoft.com/office/word/2010/wordprocessingCanvas" xmlns:cx="http://schemas.microsoft.com/office/drawing/2014/chartex" xmlns:mc="http://schemas.openxmlformats.org/markup-compatibility/2006" xmlns:o="urn:schemas-microsoft-com:office:office" xmlns:r="http://schemas.openxmlformats.org/officeDocument/2006/relationships" xmlns:m="http://schemas.openxmlformats.org/officeDocument/2006/math" xmlns:v="urn:schemas-microsoft-com:vml" xmlns:wp14="http://schemas.microsoft.com/office/word/2010/wordprocessingDrawing" xmlns:wp="http://schemas.openxmlformats.org/drawingml/2006/wordprocessingDrawing" xmlns:w10="urn:schemas-microsoft-com:office:word" xmlns:w="http://schemas.openxmlformats.org/wordprocessingml/2006/main" xmlns:w14="http://schemas.microsoft.com/office/word/2010/wordml" xmlns:w15="http://schemas.microsoft.com/office/word/2012/wordml" xmlns:w16se="http://schemas.microsoft.com/office/word/2015/wordml/symex" xmlns:wpg="http://schemas.microsoft.com/office/word/2010/wordprocessingGroup" xmlns:wpi="http://schemas.microsoft.com/office/word/2010/wordprocessingInk" xmlns:wne="http://schemas.microsoft.com/office/word/2006/wordml" xmlns:wps="http://schemas.microsoft.com/office/word/2010/wordprocessingShape" mc:Ignorable="w14 w15 w16se wp14">
   <w:endnote w:type="separator" w:id="-1">
     <w:p>
       <w:r>
@@ -4696,7 +4527,7 @@
 </file>
 
 <file path=word/footer1.xml><?xml version="1.0" encoding="utf-8"?>
-<w:ftr xmlns:wpc="http://schemas.microsoft.com/office/word/2010/wordprocessingCanvas" xmlns:cx="http://schemas.microsoft.com/office/drawing/2014/chartex" xmlns:cx1="http://schemas.microsoft.com/office/drawing/2015/9/8/chartex" xmlns:cx2="http://schemas.microsoft.com/office/drawing/2015/10/21/chartex" xmlns:cx3="http://schemas.microsoft.com/office/drawing/2016/5/9/chartex" xmlns:cx4="http://schemas.microsoft.com/office/drawing/2016/5/10/chartex" xmlns:cx5="http://schemas.microsoft.com/office/drawing/2016/5/11/chartex" xmlns:cx6="http://schemas.microsoft.com/office/drawing/2016/5/12/chartex" xmlns:cx7="http://schemas.microsoft.com/office/drawing/2016/5/13/chartex" xmlns:cx8="http://schemas.microsoft.com/office/drawing/2016/5/14/chartex" xmlns:mc="http://schemas.openxmlformats.org/markup-compatibility/2006" xmlns:aink="http://schemas.microsoft.com/office/drawing/2016/ink" xmlns:am3d="http://schemas.microsoft.com/office/drawing/2017/model3d" xmlns:o="urn:schemas-microsoft-com:office:office" xmlns:oel="http://schemas.microsoft.com/office/2019/extlst" xmlns:r="http://schemas.openxmlformats.org/officeDocument/2006/relationships" xmlns:m="http://schemas.openxmlformats.org/officeDocument/2006/math" xmlns:v="urn:schemas-microsoft-com:vml" xmlns:wp14="http://schemas.microsoft.com/office/word/2010/wordprocessingDrawing" xmlns:wp="http://schemas.openxmlformats.org/drawingml/2006/wordprocessingDrawing" xmlns:w10="urn:schemas-microsoft-com:office:word" xmlns:w="http://schemas.openxmlformats.org/wordprocessingml/2006/main" xmlns:w14="http://schemas.microsoft.com/office/word/2010/wordml" xmlns:w15="http://schemas.microsoft.com/office/word/2012/wordml" xmlns:w16cex="http://schemas.microsoft.com/office/word/2018/wordml/cex" xmlns:w16cid="http://schemas.microsoft.com/office/word/2016/wordml/cid" xmlns:w16="http://schemas.microsoft.com/office/word/2018/wordml" xmlns:w16du="http://schemas.microsoft.com/office/word/2023/wordml/word16du" xmlns:w16sdtdh="http://schemas.microsoft.com/office/word/2020/wordml/sdtdatahash" xmlns:w16sdtfl="http://schemas.microsoft.com/office/word/2024/wordml/sdtformatlock" xmlns:w16se="http://schemas.microsoft.com/office/word/2015/wordml/symex" xmlns:wpg="http://schemas.microsoft.com/office/word/2010/wordprocessingGroup" xmlns:wpi="http://schemas.microsoft.com/office/word/2010/wordprocessingInk" xmlns:wne="http://schemas.microsoft.com/office/word/2006/wordml" xmlns:wps="http://schemas.microsoft.com/office/word/2010/wordprocessingShape" mc:Ignorable="w14 w15 w16se w16cid w16 w16cex w16sdtdh w16sdtfl w16du wp14">
+<w:ftr xmlns:wpc="http://schemas.microsoft.com/office/word/2010/wordprocessingCanvas" xmlns:cx="http://schemas.microsoft.com/office/drawing/2014/chartex" xmlns:mc="http://schemas.openxmlformats.org/markup-compatibility/2006" xmlns:o="urn:schemas-microsoft-com:office:office" xmlns:r="http://schemas.openxmlformats.org/officeDocument/2006/relationships" xmlns:m="http://schemas.openxmlformats.org/officeDocument/2006/math" xmlns:v="urn:schemas-microsoft-com:vml" xmlns:wp14="http://schemas.microsoft.com/office/word/2010/wordprocessingDrawing" xmlns:wp="http://schemas.openxmlformats.org/drawingml/2006/wordprocessingDrawing" xmlns:w10="urn:schemas-microsoft-com:office:word" xmlns:w="http://schemas.openxmlformats.org/wordprocessingml/2006/main" xmlns:w14="http://schemas.microsoft.com/office/word/2010/wordml" xmlns:w15="http://schemas.microsoft.com/office/word/2012/wordml" xmlns:w16se="http://schemas.microsoft.com/office/word/2015/wordml/symex" xmlns:wpg="http://schemas.microsoft.com/office/word/2010/wordprocessingGroup" xmlns:wpi="http://schemas.microsoft.com/office/word/2010/wordprocessingInk" xmlns:wne="http://schemas.microsoft.com/office/word/2006/wordml" xmlns:wps="http://schemas.microsoft.com/office/word/2010/wordprocessingShape" mc:Ignorable="w14 w15 w16se wp14">
   <w:p>
     <w:pPr>
       <w:pBdr>
@@ -4763,7 +4594,7 @@
         <w:sz w:val="15"/>
         <w:szCs w:val="15"/>
       </w:rPr>
-      <w:t>1</w:t>
+      <w:t>5</w:t>
     </w:r>
     <w:r>
       <w:rPr>
@@ -4778,7 +4609,7 @@
 </file>
 
 <file path=word/footnotes.xml><?xml version="1.0" encoding="utf-8"?>
-<w:footnotes xmlns:wpc="http://schemas.microsoft.com/office/word/2010/wordprocessingCanvas" xmlns:cx="http://schemas.microsoft.com/office/drawing/2014/chartex" xmlns:cx1="http://schemas.microsoft.com/office/drawing/2015/9/8/chartex" xmlns:cx2="http://schemas.microsoft.com/office/drawing/2015/10/21/chartex" xmlns:cx3="http://schemas.microsoft.com/office/drawing/2016/5/9/chartex" xmlns:cx4="http://schemas.microsoft.com/office/drawing/2016/5/10/chartex" xmlns:cx5="http://schemas.microsoft.com/office/drawing/2016/5/11/chartex" xmlns:cx6="http://schemas.microsoft.com/office/drawing/2016/5/12/chartex" xmlns:cx7="http://schemas.microsoft.com/office/drawing/2016/5/13/chartex" xmlns:cx8="http://schemas.microsoft.com/office/drawing/2016/5/14/chartex" xmlns:mc="http://schemas.openxmlformats.org/markup-compatibility/2006" xmlns:aink="http://schemas.microsoft.com/office/drawing/2016/ink" xmlns:am3d="http://schemas.microsoft.com/office/drawing/2017/model3d" xmlns:o="urn:schemas-microsoft-com:office:office" xmlns:oel="http://schemas.microsoft.com/office/2019/extlst" xmlns:r="http://schemas.openxmlformats.org/officeDocument/2006/relationships" xmlns:m="http://schemas.openxmlformats.org/officeDocument/2006/math" xmlns:v="urn:schemas-microsoft-com:vml" xmlns:wp14="http://schemas.microsoft.com/office/word/2010/wordprocessingDrawing" xmlns:wp="http://schemas.openxmlformats.org/drawingml/2006/wordprocessingDrawing" xmlns:w10="urn:schemas-microsoft-com:office:word" xmlns:w="http://schemas.openxmlformats.org/wordprocessingml/2006/main" xmlns:w14="http://schemas.microsoft.com/office/word/2010/wordml" xmlns:w15="http://schemas.microsoft.com/office/word/2012/wordml" xmlns:w16cex="http://schemas.microsoft.com/office/word/2018/wordml/cex" xmlns:w16cid="http://schemas.microsoft.com/office/word/2016/wordml/cid" xmlns:w16="http://schemas.microsoft.com/office/word/2018/wordml" xmlns:w16du="http://schemas.microsoft.com/office/word/2023/wordml/word16du" xmlns:w16sdtdh="http://schemas.microsoft.com/office/word/2020/wordml/sdtdatahash" xmlns:w16sdtfl="http://schemas.microsoft.com/office/word/2024/wordml/sdtformatlock" xmlns:w16se="http://schemas.microsoft.com/office/word/2015/wordml/symex" xmlns:wpg="http://schemas.microsoft.com/office/word/2010/wordprocessingGroup" xmlns:wpi="http://schemas.microsoft.com/office/word/2010/wordprocessingInk" xmlns:wne="http://schemas.microsoft.com/office/word/2006/wordml" xmlns:wps="http://schemas.microsoft.com/office/word/2010/wordprocessingShape" mc:Ignorable="w14 w15 w16se w16cid w16 w16cex w16sdtdh w16sdtfl w16du wp14">
+<w:footnotes xmlns:wpc="http://schemas.microsoft.com/office/word/2010/wordprocessingCanvas" xmlns:cx="http://schemas.microsoft.com/office/drawing/2014/chartex" xmlns:mc="http://schemas.openxmlformats.org/markup-compatibility/2006" xmlns:o="urn:schemas-microsoft-com:office:office" xmlns:r="http://schemas.openxmlformats.org/officeDocument/2006/relationships" xmlns:m="http://schemas.openxmlformats.org/officeDocument/2006/math" xmlns:v="urn:schemas-microsoft-com:vml" xmlns:wp14="http://schemas.microsoft.com/office/word/2010/wordprocessingDrawing" xmlns:wp="http://schemas.openxmlformats.org/drawingml/2006/wordprocessingDrawing" xmlns:w10="urn:schemas-microsoft-com:office:word" xmlns:w="http://schemas.openxmlformats.org/wordprocessingml/2006/main" xmlns:w14="http://schemas.microsoft.com/office/word/2010/wordml" xmlns:w15="http://schemas.microsoft.com/office/word/2012/wordml" xmlns:w16se="http://schemas.microsoft.com/office/word/2015/wordml/symex" xmlns:wpg="http://schemas.microsoft.com/office/word/2010/wordprocessingGroup" xmlns:wpi="http://schemas.microsoft.com/office/word/2010/wordprocessingInk" xmlns:wne="http://schemas.microsoft.com/office/word/2006/wordml" xmlns:wps="http://schemas.microsoft.com/office/word/2010/wordprocessingShape" mc:Ignorable="w14 w15 w16se wp14">
   <w:footnote w:type="separator" w:id="-1">
     <w:p>
       <w:r>
@@ -4797,13 +4628,13 @@
 </file>
 
 <file path=word/header1.xml><?xml version="1.0" encoding="utf-8"?>
-<w:hdr xmlns:wpc="http://schemas.microsoft.com/office/word/2010/wordprocessingCanvas" xmlns:cx="http://schemas.microsoft.com/office/drawing/2014/chartex" xmlns:cx1="http://schemas.microsoft.com/office/drawing/2015/9/8/chartex" xmlns:cx2="http://schemas.microsoft.com/office/drawing/2015/10/21/chartex" xmlns:cx3="http://schemas.microsoft.com/office/drawing/2016/5/9/chartex" xmlns:cx4="http://schemas.microsoft.com/office/drawing/2016/5/10/chartex" xmlns:cx5="http://schemas.microsoft.com/office/drawing/2016/5/11/chartex" xmlns:cx6="http://schemas.microsoft.com/office/drawing/2016/5/12/chartex" xmlns:cx7="http://schemas.microsoft.com/office/drawing/2016/5/13/chartex" xmlns:cx8="http://schemas.microsoft.com/office/drawing/2016/5/14/chartex" xmlns:mc="http://schemas.openxmlformats.org/markup-compatibility/2006" xmlns:aink="http://schemas.microsoft.com/office/drawing/2016/ink" xmlns:am3d="http://schemas.microsoft.com/office/drawing/2017/model3d" xmlns:o="urn:schemas-microsoft-com:office:office" xmlns:oel="http://schemas.microsoft.com/office/2019/extlst" xmlns:r="http://schemas.openxmlformats.org/officeDocument/2006/relationships" xmlns:m="http://schemas.openxmlformats.org/officeDocument/2006/math" xmlns:v="urn:schemas-microsoft-com:vml" xmlns:wp14="http://schemas.microsoft.com/office/word/2010/wordprocessingDrawing" xmlns:wp="http://schemas.openxmlformats.org/drawingml/2006/wordprocessingDrawing" xmlns:w10="urn:schemas-microsoft-com:office:word" xmlns:w="http://schemas.openxmlformats.org/wordprocessingml/2006/main" xmlns:w14="http://schemas.microsoft.com/office/word/2010/wordml" xmlns:w15="http://schemas.microsoft.com/office/word/2012/wordml" xmlns:w16cex="http://schemas.microsoft.com/office/word/2018/wordml/cex" xmlns:w16cid="http://schemas.microsoft.com/office/word/2016/wordml/cid" xmlns:w16="http://schemas.microsoft.com/office/word/2018/wordml" xmlns:w16du="http://schemas.microsoft.com/office/word/2023/wordml/word16du" xmlns:w16sdtdh="http://schemas.microsoft.com/office/word/2020/wordml/sdtdatahash" xmlns:w16sdtfl="http://schemas.microsoft.com/office/word/2024/wordml/sdtformatlock" xmlns:w16se="http://schemas.microsoft.com/office/word/2015/wordml/symex" xmlns:wpg="http://schemas.microsoft.com/office/word/2010/wordprocessingGroup" xmlns:wpi="http://schemas.microsoft.com/office/word/2010/wordprocessingInk" xmlns:wne="http://schemas.microsoft.com/office/word/2006/wordml" xmlns:wps="http://schemas.microsoft.com/office/word/2010/wordprocessingShape" mc:Ignorable="w14 w15 w16se w16cid w16 w16cex w16sdtdh w16sdtfl w16du wp14">
+<w:hdr xmlns:wpc="http://schemas.microsoft.com/office/word/2010/wordprocessingCanvas" xmlns:cx="http://schemas.microsoft.com/office/drawing/2014/chartex" xmlns:mc="http://schemas.openxmlformats.org/markup-compatibility/2006" xmlns:o="urn:schemas-microsoft-com:office:office" xmlns:r="http://schemas.openxmlformats.org/officeDocument/2006/relationships" xmlns:m="http://schemas.openxmlformats.org/officeDocument/2006/math" xmlns:v="urn:schemas-microsoft-com:vml" xmlns:wp14="http://schemas.microsoft.com/office/word/2010/wordprocessingDrawing" xmlns:wp="http://schemas.openxmlformats.org/drawingml/2006/wordprocessingDrawing" xmlns:w10="urn:schemas-microsoft-com:office:word" xmlns:w="http://schemas.openxmlformats.org/wordprocessingml/2006/main" xmlns:w14="http://schemas.microsoft.com/office/word/2010/wordml" xmlns:w15="http://schemas.microsoft.com/office/word/2012/wordml" xmlns:w16se="http://schemas.microsoft.com/office/word/2015/wordml/symex" xmlns:wpg="http://schemas.microsoft.com/office/word/2010/wordprocessingGroup" xmlns:wpi="http://schemas.microsoft.com/office/word/2010/wordprocessingInk" xmlns:wne="http://schemas.microsoft.com/office/word/2006/wordml" xmlns:wps="http://schemas.microsoft.com/office/word/2010/wordprocessingShape" mc:Ignorable="w14 w15 w16se wp14">
   <w:p/>
 </w:hdr>
 </file>
 
 <file path=word/numbering.xml><?xml version="1.0" encoding="utf-8"?>
-<w:numbering xmlns:wpc="http://schemas.microsoft.com/office/word/2010/wordprocessingCanvas" xmlns:cx="http://schemas.microsoft.com/office/drawing/2014/chartex" xmlns:cx1="http://schemas.microsoft.com/office/drawing/2015/9/8/chartex" xmlns:cx2="http://schemas.microsoft.com/office/drawing/2015/10/21/chartex" xmlns:cx3="http://schemas.microsoft.com/office/drawing/2016/5/9/chartex" xmlns:cx4="http://schemas.microsoft.com/office/drawing/2016/5/10/chartex" xmlns:cx5="http://schemas.microsoft.com/office/drawing/2016/5/11/chartex" xmlns:cx6="http://schemas.microsoft.com/office/drawing/2016/5/12/chartex" xmlns:cx7="http://schemas.microsoft.com/office/drawing/2016/5/13/chartex" xmlns:cx8="http://schemas.microsoft.com/office/drawing/2016/5/14/chartex" xmlns:mc="http://schemas.openxmlformats.org/markup-compatibility/2006" xmlns:aink="http://schemas.microsoft.com/office/drawing/2016/ink" xmlns:am3d="http://schemas.microsoft.com/office/drawing/2017/model3d" xmlns:o="urn:schemas-microsoft-com:office:office" xmlns:oel="http://schemas.microsoft.com/office/2019/extlst" xmlns:r="http://schemas.openxmlformats.org/officeDocument/2006/relationships" xmlns:m="http://schemas.openxmlformats.org/officeDocument/2006/math" xmlns:v="urn:schemas-microsoft-com:vml" xmlns:wp14="http://schemas.microsoft.com/office/word/2010/wordprocessingDrawing" xmlns:wp="http://schemas.openxmlformats.org/drawingml/2006/wordprocessingDrawing" xmlns:w10="urn:schemas-microsoft-com:office:word" xmlns:w="http://schemas.openxmlformats.org/wordprocessingml/2006/main" xmlns:w14="http://schemas.microsoft.com/office/word/2010/wordml" xmlns:w15="http://schemas.microsoft.com/office/word/2012/wordml" xmlns:w16cex="http://schemas.microsoft.com/office/word/2018/wordml/cex" xmlns:w16cid="http://schemas.microsoft.com/office/word/2016/wordml/cid" xmlns:w16="http://schemas.microsoft.com/office/word/2018/wordml" xmlns:w16du="http://schemas.microsoft.com/office/word/2023/wordml/word16du" xmlns:w16sdtdh="http://schemas.microsoft.com/office/word/2020/wordml/sdtdatahash" xmlns:w16sdtfl="http://schemas.microsoft.com/office/word/2024/wordml/sdtformatlock" xmlns:w16se="http://schemas.microsoft.com/office/word/2015/wordml/symex" xmlns:wpg="http://schemas.microsoft.com/office/word/2010/wordprocessingGroup" xmlns:wpi="http://schemas.microsoft.com/office/word/2010/wordprocessingInk" xmlns:wne="http://schemas.microsoft.com/office/word/2006/wordml" xmlns:wps="http://schemas.microsoft.com/office/word/2010/wordprocessingShape" mc:Ignorable="w14 w15 w16se w16cid w16 w16cex w16sdtdh w16sdtfl w16du wp14">
+<w:numbering xmlns:wpc="http://schemas.microsoft.com/office/word/2010/wordprocessingCanvas" xmlns:cx="http://schemas.microsoft.com/office/drawing/2014/chartex" xmlns:mc="http://schemas.openxmlformats.org/markup-compatibility/2006" xmlns:o="urn:schemas-microsoft-com:office:office" xmlns:r="http://schemas.openxmlformats.org/officeDocument/2006/relationships" xmlns:m="http://schemas.openxmlformats.org/officeDocument/2006/math" xmlns:v="urn:schemas-microsoft-com:vml" xmlns:wp14="http://schemas.microsoft.com/office/word/2010/wordprocessingDrawing" xmlns:wp="http://schemas.openxmlformats.org/drawingml/2006/wordprocessingDrawing" xmlns:w10="urn:schemas-microsoft-com:office:word" xmlns:w="http://schemas.openxmlformats.org/wordprocessingml/2006/main" xmlns:w14="http://schemas.microsoft.com/office/word/2010/wordml" xmlns:w15="http://schemas.microsoft.com/office/word/2012/wordml" xmlns:w16se="http://schemas.microsoft.com/office/word/2015/wordml/symex" xmlns:wpg="http://schemas.microsoft.com/office/word/2010/wordprocessingGroup" xmlns:wpi="http://schemas.microsoft.com/office/word/2010/wordprocessingInk" xmlns:wne="http://schemas.microsoft.com/office/word/2006/wordml" xmlns:wps="http://schemas.microsoft.com/office/word/2010/wordprocessingShape" mc:Ignorable="w14 w15 w16se wp14">
   <w:abstractNum w:abstractNumId="0" w15:restartNumberingAfterBreak="0">
     <w:nsid w:val="17A709F9"/>
     <w:multiLevelType w:val="hybridMultilevel"/>
@@ -4944,13 +4775,13 @@
       </w:pPr>
     </w:lvl>
   </w:abstractNum>
-  <w:num w:numId="1" w16cid:durableId="721831530">
+  <w:num w:numId="1">
     <w:abstractNumId w:val="1"/>
     <w:lvlOverride w:ilvl="0">
       <w:startOverride w:val="1"/>
     </w:lvlOverride>
   </w:num>
-  <w:num w:numId="2" w16cid:durableId="1790737465">
+  <w:num w:numId="2">
     <w:abstractNumId w:val="0"/>
     <w:lvlOverride w:ilvl="0">
       <w:startOverride w:val="1"/>
@@ -4960,7 +4791,7 @@
 </file>
 
 <file path=word/styles.xml><?xml version="1.0" encoding="utf-8"?>
-<w:styles xmlns:mc="http://schemas.openxmlformats.org/markup-compatibility/2006" xmlns:r="http://schemas.openxmlformats.org/officeDocument/2006/relationships" xmlns:w="http://schemas.openxmlformats.org/wordprocessingml/2006/main" xmlns:w14="http://schemas.microsoft.com/office/word/2010/wordml" xmlns:w15="http://schemas.microsoft.com/office/word/2012/wordml" xmlns:w16cex="http://schemas.microsoft.com/office/word/2018/wordml/cex" xmlns:w16cid="http://schemas.microsoft.com/office/word/2016/wordml/cid" xmlns:w16="http://schemas.microsoft.com/office/word/2018/wordml" xmlns:w16du="http://schemas.microsoft.com/office/word/2023/wordml/word16du" xmlns:w16sdtdh="http://schemas.microsoft.com/office/word/2020/wordml/sdtdatahash" xmlns:w16sdtfl="http://schemas.microsoft.com/office/word/2024/wordml/sdtformatlock" xmlns:w16se="http://schemas.microsoft.com/office/word/2015/wordml/symex" mc:Ignorable="w14 w15 w16se w16cid w16 w16cex w16sdtdh w16sdtfl w16du">
+<w:styles xmlns:mc="http://schemas.openxmlformats.org/markup-compatibility/2006" xmlns:r="http://schemas.openxmlformats.org/officeDocument/2006/relationships" xmlns:w="http://schemas.openxmlformats.org/wordprocessingml/2006/main" xmlns:w14="http://schemas.microsoft.com/office/word/2010/wordml" xmlns:w15="http://schemas.microsoft.com/office/word/2012/wordml" xmlns:w16se="http://schemas.microsoft.com/office/word/2015/wordml/symex" mc:Ignorable="w14 w15 w16se">
   <w:docDefaults>
     <w:rPrDefault>
       <w:rPr>
@@ -4971,7 +4802,7 @@
     </w:rPrDefault>
     <w:pPrDefault/>
   </w:docDefaults>
-  <w:latentStyles w:defLockedState="0" w:defUIPriority="99" w:defSemiHidden="0" w:defUnhideWhenUsed="0" w:defQFormat="0" w:count="376">
+  <w:latentStyles w:defLockedState="0" w:defUIPriority="99" w:defSemiHidden="0" w:defUnhideWhenUsed="0" w:defQFormat="0" w:count="371">
     <w:lsdException w:name="Normal" w:uiPriority="0" w:qFormat="1"/>
     <w:lsdException w:name="heading 1" w:uiPriority="9" w:qFormat="1"/>
     <w:lsdException w:name="heading 2" w:semiHidden="1" w:uiPriority="9" w:unhideWhenUsed="1" w:qFormat="1"/>
@@ -5343,11 +5174,6 @@
     <w:lsdException w:name="List Table 5 Dark Accent 6" w:uiPriority="50"/>
     <w:lsdException w:name="List Table 6 Colorful Accent 6" w:uiPriority="51"/>
     <w:lsdException w:name="List Table 7 Colorful Accent 6" w:uiPriority="52"/>
-    <w:lsdException w:name="Mention" w:semiHidden="1" w:unhideWhenUsed="1"/>
-    <w:lsdException w:name="Smart Hyperlink" w:semiHidden="1" w:unhideWhenUsed="1"/>
-    <w:lsdException w:name="Hashtag" w:semiHidden="1" w:unhideWhenUsed="1"/>
-    <w:lsdException w:name="Unresolved Mention" w:semiHidden="1" w:unhideWhenUsed="1"/>
-    <w:lsdException w:name="Smart Link" w:semiHidden="1" w:unhideWhenUsed="1"/>
   </w:latentStyles>
   <w:style w:type="paragraph" w:default="1" w:styleId="a">
     <w:name w:val="Normal"/>

</xml_diff>